<commit_message>
Mark English-law points instead of US jury and state-law boilerplate.
</commit_message>
<xml_diff>
--- a/samples/contractor/original.docx
+++ b/samples/contractor/original.docx
@@ -9,7 +9,7 @@
     </w:p>
     <w:p>
       <w:r>
-        <w:t xml:space="preserve">Contractor will design the Harbor Street wayfinding sketches described in the statement of work.</w:t>
+        <w:t xml:space="preserve">The Contractor will prepare the drawings described in the statement of work.</w:t>
       </w:r>
     </w:p>
     <w:p>
@@ -19,7 +19,7 @@
     </w:p>
     <w:p>
       <w:r>
-        <w:t xml:space="preserve">Client shall pay a fixed fee of $8,500, half on signature and half on delivery.</w:t>
+        <w:t xml:space="preserve">The Client shall pay a fixed fee of £8,500, plus VAT, half on signature and half on delivery.</w:t>
       </w:r>
     </w:p>
     <w:p>
@@ -49,7 +49,7 @@
     </w:p>
     <w:p>
       <w:r>
-        <w:t xml:space="preserve">Each party's aggregate liability is capped at the fees paid under this Agreement.</w:t>
+        <w:t xml:space="preserve">Each party's aggregate liability is capped at the fees paid under this Agreement. A claim must be brought within six (6) years of the cause of action accruing.</w:t>
       </w:r>
     </w:p>
     <w:p>
@@ -59,7 +59,7 @@
     </w:p>
     <w:p>
       <w:r>
-        <w:t xml:space="preserve">This Agreement is governed by the laws of the State of Illinois.</w:t>
+        <w:t xml:space="preserve">This Agreement is governed by the law of England and Wales. The parties submit to the exclusive jurisdiction of the courts of England and Wales.</w:t>
       </w:r>
     </w:p>
     <w:sectPr>

</xml_diff>